<commit_message>
docs: identificar autoria individual no relatório
</commit_message>
<xml_diff>
--- a/docs/relatorio-tecnico.docx
+++ b/docs/relatorio-tecnico.docx
@@ -56,7 +56,7 @@
           <w:color w:val="5D685F"/>
           <w:sz w:val="17"/>
         </w:rPr>
-        <w:t>Integrante: [preencher nome]    |    Setembro de 2026</w:t>
+        <w:t>Integrante: Jhonatan Almeida    |    Setembro de 2026</w:t>
       </w:r>
     </w:p>
     <w:p>
@@ -1678,7 +1678,7 @@
           <w:color w:val="5D685F"/>
           <w:sz w:val="18"/>
         </w:rPr>
-        <w:t>A proposta prevê equipes de quatro a seis integrantes; esta entrega foi realizada por uma pessoa. Os papéis foram acumulados e registrados individualmente, sem atribuir contribuições a outras pessoas. Para evitar dependência do disco efêmero do container, a persistência foi direcionada a um PostgreSQL gerenciado. Segredos e endereços ficam em variáveis de ambiente; o blueprint automatiza sua ligação sem gravar credenciais no repositório.</w:t>
+        <w:t>A proposta prevê equipes de quatro a seis integrantes; esta entrega foi realizada individualmente por Jhonatan Almeida. Os papéis foram acumulados e registrados sem atribuir contribuições a outras pessoas. Para evitar dependência do disco efêmero do container, a persistência foi direcionada a um PostgreSQL gerenciado. Segredos e endereços ficam em variáveis de ambiente; o blueprint automatiza sua ligação sem gravar credenciais no repositório.</w:t>
       </w:r>
     </w:p>
     <w:p>

</xml_diff>